<commit_message>
12-partiya: 'madaniy' -> 'kultural' (115, 117)
</commit_message>
<xml_diff>
--- a/Мавзу2/115.docx
+++ b/Мавзу2/115.docx
@@ -125,7 +125,7 @@
           <w:b w:val="0"/>
           <w:sz w:val="28"/>
         </w:rPr>
-        <w:t>Qo'zg'atuvchi aerob, oziq muhitiga talabchan, 37–38 °C da pH 5,8–7,0 muhitda sekin rivojlanadi [1]. Petranyani, Petrov, Levenshteyn–Yensen va glitserinli muhitlar yaxshi; glitserin sil qo'zg'atuvchisi o'sishini sekinlashtiradi, M. bovis glitseringa muhtoj emas [1]. Levenshteyn–Yensen muhiti keng qo'llanadi; Finn II muhitida asparagin o'rniga natriy glutamin bo'lgani uchun o'sish tezroq [1]. 383-son buyruqqa ko'ra madaniy tekshirishda zich muhit (Levenshteyn–Yensen) va suyuq muhit (Middlebrook 7H9) hamda MGIT avtomatik tizimi qo'llanadi; o'sish 35–37 °C da bir necha hafta davom etadi [4]. Zich muhitda R-shaklli, quruq, g'adir-budur, gulkaramga o'xshash koloniyalar o'sadi (R-shakl virulent hisoblanadi); suyuq muhitda 10–15 kundan keyin parda hosil bo'ladi, parda qalinlashib burishadi va og'irligidan cho'kadi, muhit tiniq qoladi [1]. Virulent shtamm kord-omil saqlaydi, shu sababli hujayralar bir-biriga yopishib, «o'ralgan soch» ko'rinishida o'sadi [1].</w:t>
+        <w:t>Qo'zg'atuvchi aerob, oziq muhitiga talabchan, 37–38 °C da pH 5,8–7,0 muhitda sekin rivojlanadi [1]. Petranyani, Petrov, Levenshteyn–Yensen va glitserinli muhitlar yaxshi; glitserin sil qo'zg'atuvchisi o'sishini sekinlashtiradi, M. bovis glitseringa muhtoj emas [1]. Levenshteyn–Yensen muhiti keng qo'llanadi; Finn II muhitida asparagin o'rniga natriy glutamin bo'lgani uchun o'sish tezroq [1]. 383-son buyruqqa ko'ra kultural tekshirishda zich muhit (Levenshteyn–Yensen) va suyuq muhit (Middlebrook 7H9) hamda MGIT avtomatik tizimi qo'llanadi; o'sish 35–37 °C da bir necha hafta davom etadi [4]. Zich muhitda R-shaklli, quruq, g'adir-budur, gulkaramga o'xshash koloniyalar o'sadi (R-shakl virulent hisoblanadi); suyuq muhitda 10–15 kundan keyin parda hosil bo'ladi, parda qalinlashib burishadi va og'irligidan cho'kadi, muhit tiniq qoladi [1]. Virulent shtamm kord-omil saqlaydi, shu sababli hujayralar bir-biriga yopishib, «o'ralgan soch» ko'rinishida o'sadi [1].</w:t>
       </w:r>
     </w:p>
     <w:p>
@@ -321,7 +321,7 @@
           <w:b w:val="0"/>
           <w:sz w:val="28"/>
         </w:rPr>
-        <w:t>M. tuberculosis — kislotaga chidamli, aerob, harakatsiz, sporasiz va kapsulasiz ingichka tayoqcha; Tsil–Nilsen usulida qizil bo'yaladi, Levenshteyn–Yensen va Finn II kabi muhitlarda sekin o'sadi va R-shaklli koloniyalar hosil qiladi. Fermentativ faolligi past, tuberkulin va kord-omilga ega; spora hosil qilmaydigan bakteriyalar ichida eng chidamlilaridan biri. Bu xossalar tashxisda mikroskopiya, madaniy tekshirish va tuberkulin sinamalarini belgilaydi.</w:t>
+        <w:t>M. tuberculosis — kislotaga chidamli, aerob, harakatsiz, sporasiz va kapsulasiz ingichka tayoqcha; Tsil–Nilsen usulida qizil bo'yaladi, Levenshteyn–Yensen va Finn II kabi muhitlarda sekin o'sadi va R-shaklli koloniyalar hosil qiladi. Fermentativ faolligi past, tuberkulin va kord-omilga ega; spora hosil qilmaydigan bakteriyalar ichida eng chidamlilaridan biri. Bu xossalar tashxisda mikroskopiya, kultural tekshirish va tuberkulin sinamalarini belgilaydi.</w:t>
       </w:r>
     </w:p>
     <w:p>

</xml_diff>